<commit_message>
Update text/figs with excluded incorrect observation
</commit_message>
<xml_diff>
--- a/data/L2/201_data_summary_figures/201_table1_dataset_order_table.docx
+++ b/data/L2/201_data_summary_figures/201_table1_dataset_order_table.docx
@@ -1341,7 +1341,7 @@
                 <w:szCs w:val="22"/>
                 <w:color w:val="000000"/>
               </w:rPr>
-              <w:t xml:space="preserve">28,480</w:t>
+              <w:t xml:space="preserve">28,478</w:t>
             </w:r>
           </w:p>
         </w:tc>
@@ -1503,7 +1503,7 @@
                 <w:szCs w:val="22"/>
                 <w:color w:val="000000"/>
               </w:rPr>
-              <w:t xml:space="preserve">78,260</w:t>
+              <w:t xml:space="preserve">78,258</w:t>
             </w:r>
           </w:p>
         </w:tc>

</xml_diff>